<commit_message>
docs: update project README files and synchronize question metadata in resources
</commit_message>
<xml_diff>
--- a/docs/recover/福建师范大学协和学院2025－2026学年第二学期2025级数媒专业面向对象程序设计机考试卷(A).docx
+++ b/docs/recover/福建师范大学协和学院2025－2026学年第二学期2025级数媒专业面向对象程序设计机考试卷(A).docx
@@ -802,7 +802,7 @@
           <w:rFonts w:ascii="宋体" w:hAnsi="宋体" w:cs="宋体" w:eastAsia="宋体"/>
           <w:sz w:val="21"/>
         </w:rPr>
-        <w:t>14. (2分) 在Java中，（ ）类对象可以使用值对的形式保存数据。</w:t>
+        <w:t>14. (2分) 在 Java 中，（ ）类对象可以使用键值对（key-value pair）的形式保存数据。</w:t>
       </w:r>
     </w:p>
     <w:p>
@@ -859,7 +859,7 @@
           <w:rFonts w:ascii="宋体" w:hAnsi="宋体" w:cs="宋体" w:eastAsia="宋体"/>
           <w:sz w:val="21"/>
         </w:rPr>
-        <w:t>15. (2分) 以下代码，描述正确的有：</w:t>
+        <w:t>15. (2分) 以下代码中，描述正确的是：</w:t>
       </w:r>
       <w:r>
         <w:br/>
@@ -1041,7 +1041,7 @@
           <w:rFonts w:ascii="宋体" w:hAnsi="宋体" w:cs="宋体" w:eastAsia="宋体"/>
           <w:sz w:val="21"/>
         </w:rPr>
-        <w:t>2. (2分) 选择结构也称______，其根据条件的成立与否来决定要执行哪些语句。</w:t>
+        <w:t>2. (2分) 数据类型转换方式分为自动类型转换和______两种。</w:t>
       </w:r>
     </w:p>
     <w:p>
@@ -1068,7 +1068,7 @@
           <w:rFonts w:ascii="宋体" w:hAnsi="宋体" w:cs="宋体" w:eastAsia="宋体"/>
           <w:sz w:val="21"/>
         </w:rPr>
-        <w:t>5. (2分) ______集合中元素是无序、不可重复的。</w:t>
+        <w:t>5. (2分) ______接口是List, Set和Queue等接口的父接口。</w:t>
       </w:r>
     </w:p>
     <w:p>
@@ -1148,31 +1148,6 @@
     </w:p>
     <w:p>
       <w:r>
-        <w:t/>
-      </w:r>
-    </w:p>
-    <w:p>
-      <w:r>
-        <w:t/>
-      </w:r>
-    </w:p>
-    <w:p>
-      <w:r>
-        <w:t/>
-      </w:r>
-    </w:p>
-    <w:p>
-      <w:r>
-        <w:t/>
-      </w:r>
-    </w:p>
-    <w:p>
-      <w:r>
-        <w:t/>
-      </w:r>
-    </w:p>
-    <w:p>
-      <w:r>
         <w:rPr>
           <w:rFonts w:ascii="宋体" w:hAnsi="宋体" w:cs="宋体" w:eastAsia="宋体"/>
           <w:sz w:val="21"/>
@@ -1314,31 +1289,6 @@
     </w:p>
     <w:p>
       <w:r>
-        <w:t/>
-      </w:r>
-    </w:p>
-    <w:p>
-      <w:r>
-        <w:t/>
-      </w:r>
-    </w:p>
-    <w:p>
-      <w:r>
-        <w:t/>
-      </w:r>
-    </w:p>
-    <w:p>
-      <w:r>
-        <w:t/>
-      </w:r>
-    </w:p>
-    <w:p>
-      <w:r>
-        <w:t/>
-      </w:r>
-    </w:p>
-    <w:p>
-      <w:r>
         <w:rPr>
           <w:sz w:val="24"/>
           <w:rFonts w:ascii="黑体" w:hAnsi="黑体" w:cs="黑体" w:eastAsia="黑体"/>
@@ -1347,30 +1297,129 @@
       </w:r>
     </w:p>
     <w:p>
-      <w:r>
-        <w:rPr>
-          <w:rFonts w:ascii="宋体" w:hAnsi="宋体" w:cs="宋体" w:eastAsia="宋体"/>
-          <w:sz w:val="21"/>
-        </w:rPr>
-        <w:t>1. (10分) 编写一个 Java 程序，使用嵌套循环在控制台输出一个高度为 5 行的直角三角形。要求：第 1 行输出 1 个“</w:t>
-      </w:r>
-      <w:r>
-        <w:rPr>
-          <w:i w:val="on"/>
-          <w:rFonts w:ascii="宋体" w:hAnsi="宋体" w:cs="宋体" w:eastAsia="宋体"/>
-          <w:sz w:val="21"/>
-        </w:rPr>
-        <w:t>”，第 2 行输出 2 个“</w:t>
-      </w:r>
-      <w:r>
-        <w:rPr>
-          <w:rFonts w:ascii="宋体" w:hAnsi="宋体" w:cs="宋体" w:eastAsia="宋体"/>
-          <w:sz w:val="21"/>
-        </w:rPr>
-        <w:t>”，依次递增，直到第 5 行输出 5 个“*”。</w:t>
-      </w:r>
-      <w:r>
-        <w:br/>
+      <w:pPr>
+        <w:ind w:left="480" w:hanging="240"/>
+      </w:pPr>
+      <w:r>
+        <w:rPr>
+          <w:color w:val="FF0000"/>
+          <w:rFonts w:ascii="宋体" w:hAnsi="宋体" w:cs="宋体" w:eastAsia="宋体"/>
+          <w:sz w:val="20"/>
+        </w:rPr>
+        <w:t xml:space="preserve">● </w:t>
+      </w:r>
+      <w:r>
+        <w:rPr>
+          <w:rFonts w:ascii="宋体" w:hAnsi="宋体" w:cs="宋体" w:eastAsia="宋体"/>
+          <w:sz w:val="21"/>
+        </w:rPr>
+        <w:t>测试时输入的方式可直接使用字符串定义，不使用键盘输入。</w:t>
+      </w:r>
+    </w:p>
+    <w:p>
+      <w:pPr>
+        <w:ind w:left="480" w:hanging="240"/>
+      </w:pPr>
+      <w:r>
+        <w:rPr>
+          <w:color w:val="FF0000"/>
+          <w:rFonts w:ascii="宋体" w:hAnsi="宋体" w:cs="宋体" w:eastAsia="宋体"/>
+          <w:sz w:val="20"/>
+        </w:rPr>
+        <w:t xml:space="preserve">● </w:t>
+      </w:r>
+      <w:r>
+        <w:rPr>
+          <w:rFonts w:ascii="宋体" w:hAnsi="宋体" w:cs="宋体" w:eastAsia="宋体"/>
+          <w:sz w:val="21"/>
+        </w:rPr>
+        <w:t>所有代码统一以文本格式粘贴在答题卡上的源代码框格中，如有需要可自行添加表格行数</w:t>
+      </w:r>
+    </w:p>
+    <w:p>
+      <w:pPr>
+        <w:ind w:left="480" w:hanging="240"/>
+      </w:pPr>
+      <w:r>
+        <w:rPr>
+          <w:color w:val="FF0000"/>
+          <w:rFonts w:ascii="宋体" w:hAnsi="宋体" w:cs="宋体" w:eastAsia="宋体"/>
+          <w:sz w:val="20"/>
+        </w:rPr>
+        <w:t xml:space="preserve">● </w:t>
+      </w:r>
+      <w:r>
+        <w:rPr>
+          <w:rFonts w:ascii="宋体" w:hAnsi="宋体" w:cs="宋体" w:eastAsia="宋体"/>
+          <w:sz w:val="21"/>
+        </w:rPr>
+        <w:t xml:space="preserve">Windows 10 截图快捷键 </w:t>
+      </w:r>
+      <w:r>
+        <w:rPr>
+          <w:color w:val="FF0000"/>
+          <w:rFonts w:ascii="宋体" w:hAnsi="宋体" w:cs="宋体" w:eastAsia="宋体"/>
+          <w:sz w:val="21"/>
+        </w:rPr>
+        <w:t>Win+Shift+S</w:t>
+      </w:r>
+      <w:r>
+        <w:rPr>
+          <w:rFonts w:ascii="宋体" w:hAnsi="宋体" w:cs="宋体" w:eastAsia="宋体"/>
+          <w:sz w:val="21"/>
+        </w:rPr>
+        <w:t>，选矩形截图。</w:t>
+      </w:r>
+    </w:p>
+    <w:p>
+      <w:r>
+        <w:rPr>
+          <w:rFonts w:ascii="宋体" w:hAnsi="宋体" w:cs="宋体" w:eastAsia="宋体"/>
+          <w:sz w:val="21"/>
+        </w:rPr>
+        <w:t xml:space="preserve">1. (10分) 编写一个 Java 程序，使用嵌套循环在控制台输出一个高度为 5 行的直角三角形。要求：第 1 行输出 1 个 </w:t>
+      </w:r>
+      <w:r>
+        <w:rPr>
+          <w:rFonts w:ascii="Consolas" w:hAnsi="Consolas" w:cs="Consolas" w:eastAsia="Consolas"/>
+          <w:sz w:val="21"/>
+        </w:rPr>
+        <w:t>*</w:t>
+      </w:r>
+      <w:r>
+        <w:rPr>
+          <w:rFonts w:ascii="宋体" w:hAnsi="宋体" w:cs="宋体" w:eastAsia="宋体"/>
+          <w:sz w:val="21"/>
+        </w:rPr>
+        <w:t xml:space="preserve">，第 2 行输出 2 个 </w:t>
+      </w:r>
+      <w:r>
+        <w:rPr>
+          <w:rFonts w:ascii="Consolas" w:hAnsi="Consolas" w:cs="Consolas" w:eastAsia="Consolas"/>
+          <w:sz w:val="21"/>
+        </w:rPr>
+        <w:t>*</w:t>
+      </w:r>
+      <w:r>
+        <w:rPr>
+          <w:rFonts w:ascii="宋体" w:hAnsi="宋体" w:cs="宋体" w:eastAsia="宋体"/>
+          <w:sz w:val="21"/>
+        </w:rPr>
+        <w:t xml:space="preserve">，依次递增，直到第 5 行输出 5 个 </w:t>
+      </w:r>
+      <w:r>
+        <w:rPr>
+          <w:rFonts w:ascii="Consolas" w:hAnsi="Consolas" w:cs="Consolas" w:eastAsia="Consolas"/>
+          <w:sz w:val="21"/>
+        </w:rPr>
+        <w:t>*</w:t>
+      </w:r>
+      <w:r>
+        <w:rPr>
+          <w:rFonts w:ascii="宋体" w:hAnsi="宋体" w:cs="宋体" w:eastAsia="宋体"/>
+          <w:sz w:val="21"/>
+        </w:rPr>
+        <w:t>。</w:t>
       </w:r>
       <w:r>
         <w:br/>
@@ -1439,31 +1488,6 @@
     <w:p/>
     <w:p>
       <w:r>
-        <w:t/>
-      </w:r>
-    </w:p>
-    <w:p>
-      <w:r>
-        <w:t/>
-      </w:r>
-    </w:p>
-    <w:p>
-      <w:r>
-        <w:t/>
-      </w:r>
-    </w:p>
-    <w:p>
-      <w:r>
-        <w:t/>
-      </w:r>
-    </w:p>
-    <w:p>
-      <w:r>
-        <w:t/>
-      </w:r>
-    </w:p>
-    <w:p>
-      <w:r>
         <w:rPr>
           <w:rFonts w:ascii="宋体" w:hAnsi="宋体" w:cs="宋体" w:eastAsia="宋体"/>
           <w:sz w:val="21"/>
@@ -1495,17 +1519,17 @@
           <w:rFonts w:ascii="宋体" w:hAnsi="宋体" w:cs="宋体" w:eastAsia="宋体"/>
           <w:sz w:val="21"/>
         </w:rPr>
-        <w:t>要求如下：</w:t>
-      </w:r>
-      <w:r>
-        <w:br/>
-      </w:r>
-      <w:r>
-        <w:rPr>
-          <w:rFonts w:ascii="宋体" w:hAnsi="宋体" w:cs="宋体" w:eastAsia="宋体"/>
-          <w:sz w:val="21"/>
-        </w:rPr>
-        <w:t xml:space="preserve">1. 在 </w:t>
+        <w:t xml:space="preserve">要求如下：  </w:t>
+      </w:r>
+      <w:r>
+        <w:br/>
+      </w:r>
+      <w:r>
+        <w:rPr>
+          <w:rFonts w:ascii="宋体" w:hAnsi="宋体" w:cs="宋体" w:eastAsia="宋体"/>
+          <w:sz w:val="21"/>
+        </w:rPr>
+        <w:t xml:space="preserve">(1) 在 </w:t>
       </w:r>
       <w:r>
         <w:rPr>
@@ -1595,17 +1619,17 @@
           <w:rFonts w:ascii="宋体" w:hAnsi="宋体" w:cs="宋体" w:eastAsia="宋体"/>
           <w:sz w:val="21"/>
         </w:rPr>
-        <w:t xml:space="preserve"> 类型，表示图形是否填充。</w:t>
-      </w:r>
-      <w:r>
-        <w:br/>
-      </w:r>
-      <w:r>
-        <w:rPr>
-          <w:rFonts w:ascii="宋体" w:hAnsi="宋体" w:cs="宋体" w:eastAsia="宋体"/>
-          <w:sz w:val="21"/>
-        </w:rPr>
-        <w:t xml:space="preserve">2. 为这两个属性分别提供 </w:t>
+        <w:t xml:space="preserve"> 类型，表示图形是否填充。  </w:t>
+      </w:r>
+      <w:r>
+        <w:br/>
+      </w:r>
+      <w:r>
+        <w:rPr>
+          <w:rFonts w:ascii="宋体" w:hAnsi="宋体" w:cs="宋体" w:eastAsia="宋体"/>
+          <w:sz w:val="21"/>
+        </w:rPr>
+        <w:t xml:space="preserve">(2) 为这两个属性分别提供 </w:t>
       </w:r>
       <w:r>
         <w:rPr>
@@ -1633,17 +1657,17 @@
           <w:rFonts w:ascii="宋体" w:hAnsi="宋体" w:cs="宋体" w:eastAsia="宋体"/>
           <w:sz w:val="21"/>
         </w:rPr>
-        <w:t xml:space="preserve"> 方法。</w:t>
-      </w:r>
-      <w:r>
-        <w:br/>
-      </w:r>
-      <w:r>
-        <w:rPr>
-          <w:rFonts w:ascii="宋体" w:hAnsi="宋体" w:cs="宋体" w:eastAsia="宋体"/>
-          <w:sz w:val="21"/>
-        </w:rPr>
-        <w:t>3. 提供以下两种构造方法：</w:t>
+        <w:t xml:space="preserve"> 方法。  </w:t>
+      </w:r>
+      <w:r>
+        <w:br/>
+      </w:r>
+      <w:r>
+        <w:rPr>
+          <w:rFonts w:ascii="宋体" w:hAnsi="宋体" w:cs="宋体" w:eastAsia="宋体"/>
+          <w:sz w:val="21"/>
+        </w:rPr>
+        <w:t>(3) 提供以下两种构造方法：</w:t>
       </w:r>
       <w:r>
         <w:br/>
@@ -1691,17 +1715,17 @@
           <w:rFonts w:ascii="宋体" w:hAnsi="宋体" w:cs="宋体" w:eastAsia="宋体"/>
           <w:sz w:val="21"/>
         </w:rPr>
-        <w:t xml:space="preserve"> 赋值。</w:t>
-      </w:r>
-      <w:r>
-        <w:br/>
-      </w:r>
-      <w:r>
-        <w:rPr>
-          <w:rFonts w:ascii="宋体" w:hAnsi="宋体" w:cs="宋体" w:eastAsia="宋体"/>
-          <w:sz w:val="21"/>
-        </w:rPr>
-        <w:t xml:space="preserve">4. 在 </w:t>
+        <w:t xml:space="preserve"> 赋值。  </w:t>
+      </w:r>
+      <w:r>
+        <w:br/>
+      </w:r>
+      <w:r>
+        <w:rPr>
+          <w:rFonts w:ascii="宋体" w:hAnsi="宋体" w:cs="宋体" w:eastAsia="宋体"/>
+          <w:sz w:val="21"/>
+        </w:rPr>
+        <w:t xml:space="preserve">(4) 在 </w:t>
       </w:r>
       <w:r>
         <w:rPr>
@@ -1729,17 +1753,17 @@
           <w:rFonts w:ascii="宋体" w:hAnsi="宋体" w:cs="宋体" w:eastAsia="宋体"/>
           <w:sz w:val="21"/>
         </w:rPr>
-        <w:t>，用于返回图形面积。</w:t>
-      </w:r>
-      <w:r>
-        <w:br/>
-      </w:r>
-      <w:r>
-        <w:rPr>
-          <w:rFonts w:ascii="宋体" w:hAnsi="宋体" w:cs="宋体" w:eastAsia="宋体"/>
-          <w:sz w:val="21"/>
-        </w:rPr>
-        <w:t xml:space="preserve">5. 编写一个子类 </w:t>
+        <w:t xml:space="preserve">，用于返回图形面积。  </w:t>
+      </w:r>
+      <w:r>
+        <w:br/>
+      </w:r>
+      <w:r>
+        <w:rPr>
+          <w:rFonts w:ascii="宋体" w:hAnsi="宋体" w:cs="宋体" w:eastAsia="宋体"/>
+          <w:sz w:val="21"/>
+        </w:rPr>
+        <w:t xml:space="preserve">(5) 编写一个子类 </w:t>
       </w:r>
       <w:r>
         <w:rPr>
@@ -1795,17 +1819,17 @@
           <w:rFonts w:ascii="宋体" w:hAnsi="宋体" w:cs="宋体" w:eastAsia="宋体"/>
           <w:sz w:val="21"/>
         </w:rPr>
-        <w:t xml:space="preserve"> 方法。</w:t>
-      </w:r>
-      <w:r>
-        <w:br/>
-      </w:r>
-      <w:r>
-        <w:rPr>
-          <w:rFonts w:ascii="宋体" w:hAnsi="宋体" w:cs="宋体" w:eastAsia="宋体"/>
-          <w:sz w:val="21"/>
-        </w:rPr>
-        <w:t xml:space="preserve">6. 编写测试类，在 </w:t>
+        <w:t xml:space="preserve"> 方法。  </w:t>
+      </w:r>
+      <w:r>
+        <w:br/>
+      </w:r>
+      <w:r>
+        <w:rPr>
+          <w:rFonts w:ascii="宋体" w:hAnsi="宋体" w:cs="宋体" w:eastAsia="宋体"/>
+          <w:sz w:val="21"/>
+        </w:rPr>
+        <w:t xml:space="preserve">(6) 编写测试类，在 </w:t>
       </w:r>
       <w:r>
         <w:rPr>
@@ -1843,7 +1867,15 @@
           <w:rFonts w:ascii="宋体" w:hAnsi="宋体" w:cs="宋体" w:eastAsia="宋体"/>
           <w:sz w:val="21"/>
         </w:rPr>
-        <w:t xml:space="preserve">   - 测试数据建议：</w:t>
+        <w:t xml:space="preserve"> </w:t>
+      </w:r>
+      <w:r>
+        <w:rPr>
+          <w:b w:val="on"/>
+          <w:rFonts w:ascii="宋体" w:hAnsi="宋体" w:cs="宋体" w:eastAsia="宋体"/>
+          <w:sz w:val="21"/>
+        </w:rPr>
+        <w:t>测试数据示例：</w:t>
       </w:r>
       <w:r>
         <w:br/>
@@ -1948,551 +1980,6 @@
           <w:sz w:val="21"/>
         </w:rPr>
         <w:t>预期输出示例：</w:t>
-      </w:r>
-      <w:r>
-        <w:br/>
-      </w:r>
-      <w:r>
-        <w:rPr>
-          <w:rFonts w:ascii="宋体" w:hAnsi="宋体" w:cs="宋体" w:eastAsia="宋体"/>
-          <w:sz w:val="21"/>
-        </w:rPr>
-        <w:t>圆1：</w:t>
-      </w:r>
-      <w:r>
-        <w:br/>
-      </w:r>
-      <w:r>
-        <w:rPr>
-          <w:rFonts w:ascii="宋体" w:hAnsi="宋体" w:cs="宋体" w:eastAsia="宋体"/>
-          <w:sz w:val="21"/>
-        </w:rPr>
-        <w:t>颜色：red</w:t>
-      </w:r>
-      <w:r>
-        <w:br/>
-      </w:r>
-      <w:r>
-        <w:rPr>
-          <w:rFonts w:ascii="宋体" w:hAnsi="宋体" w:cs="宋体" w:eastAsia="宋体"/>
-          <w:sz w:val="21"/>
-        </w:rPr>
-        <w:t>是否填充：true</w:t>
-      </w:r>
-      <w:r>
-        <w:br/>
-      </w:r>
-      <w:r>
-        <w:rPr>
-          <w:rFonts w:ascii="宋体" w:hAnsi="宋体" w:cs="宋体" w:eastAsia="宋体"/>
-          <w:sz w:val="21"/>
-        </w:rPr>
-        <w:t>面积：78.53981633974483</w:t>
-      </w:r>
-      <w:r>
-        <w:br/>
-      </w:r>
-      <w:r>
-        <w:rPr>
-          <w:rFonts w:ascii="宋体" w:hAnsi="宋体" w:cs="宋体" w:eastAsia="宋体"/>
-          <w:sz w:val="21"/>
-        </w:rPr>
-        <w:t>圆2：</w:t>
-      </w:r>
-      <w:r>
-        <w:br/>
-      </w:r>
-      <w:r>
-        <w:rPr>
-          <w:rFonts w:ascii="宋体" w:hAnsi="宋体" w:cs="宋体" w:eastAsia="宋体"/>
-          <w:sz w:val="21"/>
-        </w:rPr>
-        <w:t>颜色：blue</w:t>
-      </w:r>
-      <w:r>
-        <w:br/>
-      </w:r>
-      <w:r>
-        <w:rPr>
-          <w:rFonts w:ascii="宋体" w:hAnsi="宋体" w:cs="宋体" w:eastAsia="宋体"/>
-          <w:sz w:val="21"/>
-        </w:rPr>
-        <w:t>是否填充：false</w:t>
-      </w:r>
-      <w:r>
-        <w:br/>
-      </w:r>
-      <w:r>
-        <w:rPr>
-          <w:rFonts w:ascii="宋体" w:hAnsi="宋体" w:cs="宋体" w:eastAsia="宋体"/>
-          <w:sz w:val="21"/>
-        </w:rPr>
-        <w:t>面积：28.274333882308138</w:t>
-      </w:r>
-    </w:p>
-    <w:p>
-      <w:r>
-        <w:t/>
-      </w:r>
-    </w:p>
-    <w:p>
-      <w:r>
-        <w:t/>
-      </w:r>
-    </w:p>
-    <w:p>
-      <w:r>
-        <w:t/>
-      </w:r>
-    </w:p>
-    <w:p>
-      <w:r>
-        <w:t/>
-      </w:r>
-    </w:p>
-    <w:p>
-      <w:r>
-        <w:t/>
-      </w:r>
-    </w:p>
-    <w:p>
-      <w:r>
-        <w:rPr>
-          <w:rFonts w:ascii="宋体" w:hAnsi="宋体" w:cs="宋体" w:eastAsia="宋体"/>
-          <w:sz w:val="21"/>
-        </w:rPr>
-        <w:t xml:space="preserve">3. (20分) 智能家居系统原先使用一个 </w:t>
-      </w:r>
-      <w:r>
-        <w:rPr>
-          <w:rFonts w:ascii="Consolas" w:hAnsi="Consolas" w:cs="Consolas" w:eastAsia="Consolas"/>
-          <w:sz w:val="21"/>
-        </w:rPr>
-        <w:t>List&lt;Device&gt;</w:t>
-      </w:r>
-      <w:r>
-        <w:rPr>
-          <w:rFonts w:ascii="宋体" w:hAnsi="宋体" w:cs="宋体" w:eastAsia="宋体"/>
-          <w:sz w:val="21"/>
-        </w:rPr>
-        <w:t xml:space="preserve"> 保存所有设备信息。由于设备 </w:t>
-      </w:r>
-      <w:r>
-        <w:rPr>
-          <w:rFonts w:ascii="Consolas" w:hAnsi="Consolas" w:cs="Consolas" w:eastAsia="Consolas"/>
-          <w:sz w:val="21"/>
-        </w:rPr>
-        <w:t>id</w:t>
-      </w:r>
-      <w:r>
-        <w:rPr>
-          <w:rFonts w:ascii="宋体" w:hAnsi="宋体" w:cs="宋体" w:eastAsia="宋体"/>
-          <w:sz w:val="21"/>
-        </w:rPr>
-        <w:t xml:space="preserve"> 是唯一标识，若需要根据 </w:t>
-      </w:r>
-      <w:r>
-        <w:rPr>
-          <w:rFonts w:ascii="Consolas" w:hAnsi="Consolas" w:cs="Consolas" w:eastAsia="Consolas"/>
-          <w:sz w:val="21"/>
-        </w:rPr>
-        <w:t>id</w:t>
-      </w:r>
-      <w:r>
-        <w:rPr>
-          <w:rFonts w:ascii="宋体" w:hAnsi="宋体" w:cs="宋体" w:eastAsia="宋体"/>
-          <w:sz w:val="21"/>
-        </w:rPr>
-        <w:t xml:space="preserve"> 查询设备，只能从头到尾遍历列表逐个比较，查询效率较低。</w:t>
-      </w:r>
-      <w:r>
-        <w:br/>
-      </w:r>
-      <w:r>
-        <w:br/>
-      </w:r>
-      <w:r>
-        <w:rPr>
-          <w:rFonts w:ascii="宋体" w:hAnsi="宋体" w:cs="宋体" w:eastAsia="宋体"/>
-          <w:sz w:val="21"/>
-        </w:rPr>
-        <w:t xml:space="preserve">请使用 </w:t>
-      </w:r>
-      <w:r>
-        <w:rPr>
-          <w:rFonts w:ascii="Consolas" w:hAnsi="Consolas" w:cs="Consolas" w:eastAsia="Consolas"/>
-          <w:sz w:val="21"/>
-        </w:rPr>
-        <w:t>HashMap</w:t>
-      </w:r>
-      <w:r>
-        <w:rPr>
-          <w:rFonts w:ascii="宋体" w:hAnsi="宋体" w:cs="宋体" w:eastAsia="宋体"/>
-          <w:sz w:val="21"/>
-        </w:rPr>
-        <w:t xml:space="preserve"> 对该存储方案进行优化，要求如下：</w:t>
-      </w:r>
-      <w:r>
-        <w:br/>
-      </w:r>
-      <w:r>
-        <w:rPr>
-          <w:rFonts w:ascii="宋体" w:hAnsi="宋体" w:cs="宋体" w:eastAsia="宋体"/>
-          <w:sz w:val="21"/>
-        </w:rPr>
-        <w:t xml:space="preserve">1. 使用 </w:t>
-      </w:r>
-      <w:r>
-        <w:rPr>
-          <w:rFonts w:ascii="Consolas" w:hAnsi="Consolas" w:cs="Consolas" w:eastAsia="Consolas"/>
-          <w:sz w:val="21"/>
-        </w:rPr>
-        <w:t>HashMap&lt;String, Device&gt;</w:t>
-      </w:r>
-      <w:r>
-        <w:rPr>
-          <w:rFonts w:ascii="宋体" w:hAnsi="宋体" w:cs="宋体" w:eastAsia="宋体"/>
-          <w:sz w:val="21"/>
-        </w:rPr>
-        <w:t xml:space="preserve"> 保存设备信息，其中键为设备 </w:t>
-      </w:r>
-      <w:r>
-        <w:rPr>
-          <w:rFonts w:ascii="Consolas" w:hAnsi="Consolas" w:cs="Consolas" w:eastAsia="Consolas"/>
-          <w:sz w:val="21"/>
-        </w:rPr>
-        <w:t>id</w:t>
-      </w:r>
-      <w:r>
-        <w:rPr>
-          <w:rFonts w:ascii="宋体" w:hAnsi="宋体" w:cs="宋体" w:eastAsia="宋体"/>
-          <w:sz w:val="21"/>
-        </w:rPr>
-        <w:t xml:space="preserve">，值为对应的 </w:t>
-      </w:r>
-      <w:r>
-        <w:rPr>
-          <w:rFonts w:ascii="Consolas" w:hAnsi="Consolas" w:cs="Consolas" w:eastAsia="Consolas"/>
-          <w:sz w:val="21"/>
-        </w:rPr>
-        <w:t>Device</w:t>
-      </w:r>
-      <w:r>
-        <w:rPr>
-          <w:rFonts w:ascii="宋体" w:hAnsi="宋体" w:cs="宋体" w:eastAsia="宋体"/>
-          <w:sz w:val="21"/>
-        </w:rPr>
-        <w:t xml:space="preserve"> 对象。</w:t>
-      </w:r>
-      <w:r>
-        <w:br/>
-      </w:r>
-      <w:r>
-        <w:rPr>
-          <w:rFonts w:ascii="宋体" w:hAnsi="宋体" w:cs="宋体" w:eastAsia="宋体"/>
-          <w:sz w:val="21"/>
-        </w:rPr>
-        <w:t>2. 实现以下功能：</w:t>
-      </w:r>
-      <w:r>
-        <w:br/>
-      </w:r>
-      <w:r>
-        <w:rPr>
-          <w:rFonts w:ascii="宋体" w:hAnsi="宋体" w:cs="宋体" w:eastAsia="宋体"/>
-          <w:sz w:val="21"/>
-        </w:rPr>
-        <w:t xml:space="preserve">   - 添加设备信息</w:t>
-      </w:r>
-      <w:r>
-        <w:br/>
-      </w:r>
-      <w:r>
-        <w:rPr>
-          <w:rFonts w:ascii="宋体" w:hAnsi="宋体" w:cs="宋体" w:eastAsia="宋体"/>
-          <w:sz w:val="21"/>
-        </w:rPr>
-        <w:t xml:space="preserve">   - 根据 </w:t>
-      </w:r>
-      <w:r>
-        <w:rPr>
-          <w:rFonts w:ascii="Consolas" w:hAnsi="Consolas" w:cs="Consolas" w:eastAsia="Consolas"/>
-          <w:sz w:val="21"/>
-        </w:rPr>
-        <w:t>id</w:t>
-      </w:r>
-      <w:r>
-        <w:rPr>
-          <w:rFonts w:ascii="宋体" w:hAnsi="宋体" w:cs="宋体" w:eastAsia="宋体"/>
-          <w:sz w:val="21"/>
-        </w:rPr>
-        <w:t xml:space="preserve"> 查询设备信息</w:t>
-      </w:r>
-      <w:r>
-        <w:br/>
-      </w:r>
-      <w:r>
-        <w:rPr>
-          <w:rFonts w:ascii="宋体" w:hAnsi="宋体" w:cs="宋体" w:eastAsia="宋体"/>
-          <w:sz w:val="21"/>
-        </w:rPr>
-        <w:t xml:space="preserve">   - 根据 </w:t>
-      </w:r>
-      <w:r>
-        <w:rPr>
-          <w:rFonts w:ascii="Consolas" w:hAnsi="Consolas" w:cs="Consolas" w:eastAsia="Consolas"/>
-          <w:sz w:val="21"/>
-        </w:rPr>
-        <w:t>id</w:t>
-      </w:r>
-      <w:r>
-        <w:rPr>
-          <w:rFonts w:ascii="宋体" w:hAnsi="宋体" w:cs="宋体" w:eastAsia="宋体"/>
-          <w:sz w:val="21"/>
-        </w:rPr>
-        <w:t xml:space="preserve"> 删除设备信息</w:t>
-      </w:r>
-      <w:r>
-        <w:br/>
-      </w:r>
-      <w:r>
-        <w:rPr>
-          <w:rFonts w:ascii="宋体" w:hAnsi="宋体" w:cs="宋体" w:eastAsia="宋体"/>
-          <w:sz w:val="21"/>
-        </w:rPr>
-        <w:t xml:space="preserve">3. 编写 </w:t>
-      </w:r>
-      <w:r>
-        <w:rPr>
-          <w:rFonts w:ascii="Consolas" w:hAnsi="Consolas" w:cs="Consolas" w:eastAsia="Consolas"/>
-          <w:sz w:val="21"/>
-        </w:rPr>
-        <w:t>Main</w:t>
-      </w:r>
-      <w:r>
-        <w:rPr>
-          <w:rFonts w:ascii="宋体" w:hAnsi="宋体" w:cs="宋体" w:eastAsia="宋体"/>
-          <w:sz w:val="21"/>
-        </w:rPr>
-        <w:t xml:space="preserve"> 测试类，演示 </w:t>
-      </w:r>
-      <w:r>
-        <w:rPr>
-          <w:rFonts w:ascii="Consolas" w:hAnsi="Consolas" w:cs="Consolas" w:eastAsia="Consolas"/>
-          <w:sz w:val="21"/>
-        </w:rPr>
-        <w:t>HashMap</w:t>
-      </w:r>
-      <w:r>
-        <w:rPr>
-          <w:rFonts w:ascii="宋体" w:hAnsi="宋体" w:cs="宋体" w:eastAsia="宋体"/>
-          <w:sz w:val="21"/>
-        </w:rPr>
-        <w:t xml:space="preserve"> 的存储、查询和删除过程。</w:t>
-      </w:r>
-      <w:r>
-        <w:br/>
-      </w:r>
-      <w:r>
-        <w:br/>
-      </w:r>
-      <w:r>
-        <w:rPr>
-          <w:rFonts w:ascii="宋体" w:hAnsi="宋体" w:cs="宋体" w:eastAsia="宋体"/>
-          <w:sz w:val="21"/>
-        </w:rPr>
-        <w:t>### 测试数据示例</w:t>
-      </w:r>
-      <w:r>
-        <w:br/>
-      </w:r>
-      <w:r>
-        <w:rPr>
-          <w:rFonts w:ascii="宋体" w:hAnsi="宋体" w:cs="宋体" w:eastAsia="宋体"/>
-          <w:sz w:val="21"/>
-        </w:rPr>
-        <w:t xml:space="preserve">请在 </w:t>
-      </w:r>
-      <w:r>
-        <w:rPr>
-          <w:rFonts w:ascii="Consolas" w:hAnsi="Consolas" w:cs="Consolas" w:eastAsia="Consolas"/>
-          <w:sz w:val="21"/>
-        </w:rPr>
-        <w:t>Main</w:t>
-      </w:r>
-      <w:r>
-        <w:rPr>
-          <w:rFonts w:ascii="宋体" w:hAnsi="宋体" w:cs="宋体" w:eastAsia="宋体"/>
-          <w:sz w:val="21"/>
-        </w:rPr>
-        <w:t xml:space="preserve"> 类中使用以下测试数据进行演示：</w:t>
-      </w:r>
-      <w:r>
-        <w:br/>
-      </w:r>
-      <w:r>
-        <w:rPr>
-          <w:rFonts w:ascii="宋体" w:hAnsi="宋体" w:cs="宋体" w:eastAsia="宋体"/>
-          <w:sz w:val="21"/>
-        </w:rPr>
-        <w:t>- 添加设备：</w:t>
-      </w:r>
-      <w:r>
-        <w:br/>
-      </w:r>
-      <w:r>
-        <w:rPr>
-          <w:rFonts w:ascii="宋体" w:hAnsi="宋体" w:cs="宋体" w:eastAsia="宋体"/>
-          <w:sz w:val="21"/>
-        </w:rPr>
-        <w:t xml:space="preserve">  - </w:t>
-      </w:r>
-      <w:r>
-        <w:rPr>
-          <w:rFonts w:ascii="Consolas" w:hAnsi="Consolas" w:cs="Consolas" w:eastAsia="Consolas"/>
-          <w:sz w:val="21"/>
-        </w:rPr>
-        <w:t>101</w:t>
-      </w:r>
-      <w:r>
-        <w:rPr>
-          <w:rFonts w:ascii="宋体" w:hAnsi="宋体" w:cs="宋体" w:eastAsia="宋体"/>
-          <w:sz w:val="21"/>
-        </w:rPr>
-        <w:t>，</w:t>
-      </w:r>
-      <w:r>
-        <w:rPr>
-          <w:rFonts w:ascii="Consolas" w:hAnsi="Consolas" w:cs="Consolas" w:eastAsia="Consolas"/>
-          <w:sz w:val="21"/>
-        </w:rPr>
-        <w:t>智能灯</w:t>
-      </w:r>
-      <w:r>
-        <w:br/>
-      </w:r>
-      <w:r>
-        <w:rPr>
-          <w:rFonts w:ascii="宋体" w:hAnsi="宋体" w:cs="宋体" w:eastAsia="宋体"/>
-          <w:sz w:val="21"/>
-        </w:rPr>
-        <w:t xml:space="preserve">  - </w:t>
-      </w:r>
-      <w:r>
-        <w:rPr>
-          <w:rFonts w:ascii="Consolas" w:hAnsi="Consolas" w:cs="Consolas" w:eastAsia="Consolas"/>
-          <w:sz w:val="21"/>
-        </w:rPr>
-        <w:t>102</w:t>
-      </w:r>
-      <w:r>
-        <w:rPr>
-          <w:rFonts w:ascii="宋体" w:hAnsi="宋体" w:cs="宋体" w:eastAsia="宋体"/>
-          <w:sz w:val="21"/>
-        </w:rPr>
-        <w:t>，</w:t>
-      </w:r>
-      <w:r>
-        <w:rPr>
-          <w:rFonts w:ascii="Consolas" w:hAnsi="Consolas" w:cs="Consolas" w:eastAsia="Consolas"/>
-          <w:sz w:val="21"/>
-        </w:rPr>
-        <w:t>智能空调</w:t>
-      </w:r>
-      <w:r>
-        <w:br/>
-      </w:r>
-      <w:r>
-        <w:rPr>
-          <w:rFonts w:ascii="宋体" w:hAnsi="宋体" w:cs="宋体" w:eastAsia="宋体"/>
-          <w:sz w:val="21"/>
-        </w:rPr>
-        <w:t xml:space="preserve">  - </w:t>
-      </w:r>
-      <w:r>
-        <w:rPr>
-          <w:rFonts w:ascii="Consolas" w:hAnsi="Consolas" w:cs="Consolas" w:eastAsia="Consolas"/>
-          <w:sz w:val="21"/>
-        </w:rPr>
-        <w:t>103</w:t>
-      </w:r>
-      <w:r>
-        <w:rPr>
-          <w:rFonts w:ascii="宋体" w:hAnsi="宋体" w:cs="宋体" w:eastAsia="宋体"/>
-          <w:sz w:val="21"/>
-        </w:rPr>
-        <w:t>，</w:t>
-      </w:r>
-      <w:r>
-        <w:rPr>
-          <w:rFonts w:ascii="Consolas" w:hAnsi="Consolas" w:cs="Consolas" w:eastAsia="Consolas"/>
-          <w:sz w:val="21"/>
-        </w:rPr>
-        <w:t>智能门锁</w:t>
-      </w:r>
-      <w:r>
-        <w:br/>
-      </w:r>
-      <w:r>
-        <w:rPr>
-          <w:rFonts w:ascii="宋体" w:hAnsi="宋体" w:cs="宋体" w:eastAsia="宋体"/>
-          <w:sz w:val="21"/>
-        </w:rPr>
-        <w:t>- 查询设备：</w:t>
-      </w:r>
-      <w:r>
-        <w:rPr>
-          <w:rFonts w:ascii="Consolas" w:hAnsi="Consolas" w:cs="Consolas" w:eastAsia="Consolas"/>
-          <w:sz w:val="21"/>
-        </w:rPr>
-        <w:t>102</w:t>
-      </w:r>
-      <w:r>
-        <w:br/>
-      </w:r>
-      <w:r>
-        <w:rPr>
-          <w:rFonts w:ascii="宋体" w:hAnsi="宋体" w:cs="宋体" w:eastAsia="宋体"/>
-          <w:sz w:val="21"/>
-        </w:rPr>
-        <w:t>- 删除设备：</w:t>
-      </w:r>
-      <w:r>
-        <w:rPr>
-          <w:rFonts w:ascii="Consolas" w:hAnsi="Consolas" w:cs="Consolas" w:eastAsia="Consolas"/>
-          <w:sz w:val="21"/>
-        </w:rPr>
-        <w:t>102</w:t>
-      </w:r>
-      <w:r>
-        <w:br/>
-      </w:r>
-      <w:r>
-        <w:rPr>
-          <w:rFonts w:ascii="宋体" w:hAnsi="宋体" w:cs="宋体" w:eastAsia="宋体"/>
-          <w:sz w:val="21"/>
-        </w:rPr>
-        <w:t>- 删除后再次查询：</w:t>
-      </w:r>
-      <w:r>
-        <w:rPr>
-          <w:rFonts w:ascii="Consolas" w:hAnsi="Consolas" w:cs="Consolas" w:eastAsia="Consolas"/>
-          <w:sz w:val="21"/>
-        </w:rPr>
-        <w:t>102</w:t>
-      </w:r>
-      <w:r>
-        <w:br/>
-      </w:r>
-      <w:r>
-        <w:br/>
-      </w:r>
-      <w:r>
-        <w:rPr>
-          <w:rFonts w:ascii="宋体" w:hAnsi="宋体" w:cs="宋体" w:eastAsia="宋体"/>
-          <w:sz w:val="21"/>
-        </w:rPr>
-        <w:t>### 预期输出示例</w:t>
       </w:r>
     </w:p>
     <w:p>
@@ -2505,6 +1992,492 @@
           <w:rFonts w:ascii="Consolas" w:hAnsi="Consolas" w:cs="Consolas" w:eastAsia="Consolas"/>
           <w:sz w:val="20"/>
         </w:rPr>
+        <w:t>圆1：</w:t>
+      </w:r>
+      <w:r>
+        <w:br/>
+      </w:r>
+      <w:r>
+        <w:rPr>
+          <w:rFonts w:ascii="Consolas" w:hAnsi="Consolas" w:cs="Consolas" w:eastAsia="Consolas"/>
+          <w:sz w:val="20"/>
+        </w:rPr>
+        <w:t>颜色：red</w:t>
+      </w:r>
+      <w:r>
+        <w:br/>
+      </w:r>
+      <w:r>
+        <w:rPr>
+          <w:rFonts w:ascii="Consolas" w:hAnsi="Consolas" w:cs="Consolas" w:eastAsia="Consolas"/>
+          <w:sz w:val="20"/>
+        </w:rPr>
+        <w:t>是否填充：true</w:t>
+      </w:r>
+      <w:r>
+        <w:br/>
+      </w:r>
+      <w:r>
+        <w:rPr>
+          <w:rFonts w:ascii="Consolas" w:hAnsi="Consolas" w:cs="Consolas" w:eastAsia="Consolas"/>
+          <w:sz w:val="20"/>
+        </w:rPr>
+        <w:t>面积：78.53981633974483</w:t>
+      </w:r>
+      <w:r>
+        <w:br/>
+      </w:r>
+      <w:r>
+        <w:rPr>
+          <w:rFonts w:ascii="Consolas" w:hAnsi="Consolas" w:cs="Consolas" w:eastAsia="Consolas"/>
+          <w:sz w:val="20"/>
+        </w:rPr>
+        <w:t>圆2：</w:t>
+      </w:r>
+      <w:r>
+        <w:br/>
+      </w:r>
+      <w:r>
+        <w:rPr>
+          <w:rFonts w:ascii="Consolas" w:hAnsi="Consolas" w:cs="Consolas" w:eastAsia="Consolas"/>
+          <w:sz w:val="20"/>
+        </w:rPr>
+        <w:t>颜色：blue</w:t>
+      </w:r>
+      <w:r>
+        <w:br/>
+      </w:r>
+      <w:r>
+        <w:rPr>
+          <w:rFonts w:ascii="Consolas" w:hAnsi="Consolas" w:cs="Consolas" w:eastAsia="Consolas"/>
+          <w:sz w:val="20"/>
+        </w:rPr>
+        <w:t>是否填充：false</w:t>
+      </w:r>
+      <w:r>
+        <w:br/>
+      </w:r>
+      <w:r>
+        <w:rPr>
+          <w:rFonts w:ascii="Consolas" w:hAnsi="Consolas" w:cs="Consolas" w:eastAsia="Consolas"/>
+          <w:sz w:val="20"/>
+        </w:rPr>
+        <w:t>面积：28.274333882308138</w:t>
+      </w:r>
+    </w:p>
+    <w:p/>
+    <w:p>
+      <w:r>
+        <w:rPr>
+          <w:rFonts w:ascii="宋体" w:hAnsi="宋体" w:cs="宋体" w:eastAsia="宋体"/>
+          <w:sz w:val="21"/>
+        </w:rPr>
+        <w:t xml:space="preserve">3. (20分) 智能家居系统原先使用一个 </w:t>
+      </w:r>
+      <w:r>
+        <w:rPr>
+          <w:rFonts w:ascii="Consolas" w:hAnsi="Consolas" w:cs="Consolas" w:eastAsia="Consolas"/>
+          <w:sz w:val="21"/>
+        </w:rPr>
+        <w:t>List&lt;Device&gt;</w:t>
+      </w:r>
+      <w:r>
+        <w:rPr>
+          <w:rFonts w:ascii="宋体" w:hAnsi="宋体" w:cs="宋体" w:eastAsia="宋体"/>
+          <w:sz w:val="21"/>
+        </w:rPr>
+        <w:t xml:space="preserve"> 保存所有设备信息。由于设备 </w:t>
+      </w:r>
+      <w:r>
+        <w:rPr>
+          <w:rFonts w:ascii="Consolas" w:hAnsi="Consolas" w:cs="Consolas" w:eastAsia="Consolas"/>
+          <w:sz w:val="21"/>
+        </w:rPr>
+        <w:t>id</w:t>
+      </w:r>
+      <w:r>
+        <w:rPr>
+          <w:rFonts w:ascii="宋体" w:hAnsi="宋体" w:cs="宋体" w:eastAsia="宋体"/>
+          <w:sz w:val="21"/>
+        </w:rPr>
+        <w:t xml:space="preserve"> 是唯一标识，若需要根据 </w:t>
+      </w:r>
+      <w:r>
+        <w:rPr>
+          <w:rFonts w:ascii="Consolas" w:hAnsi="Consolas" w:cs="Consolas" w:eastAsia="Consolas"/>
+          <w:sz w:val="21"/>
+        </w:rPr>
+        <w:t>id</w:t>
+      </w:r>
+      <w:r>
+        <w:rPr>
+          <w:rFonts w:ascii="宋体" w:hAnsi="宋体" w:cs="宋体" w:eastAsia="宋体"/>
+          <w:sz w:val="21"/>
+        </w:rPr>
+        <w:t xml:space="preserve"> 查询设备，只能从头到尾遍历列表逐个比较，查询效率较低。请使用 </w:t>
+      </w:r>
+      <w:r>
+        <w:rPr>
+          <w:rFonts w:ascii="Consolas" w:hAnsi="Consolas" w:cs="Consolas" w:eastAsia="Consolas"/>
+          <w:sz w:val="21"/>
+        </w:rPr>
+        <w:t>HashMap</w:t>
+      </w:r>
+      <w:r>
+        <w:rPr>
+          <w:rFonts w:ascii="宋体" w:hAnsi="宋体" w:cs="宋体" w:eastAsia="宋体"/>
+          <w:sz w:val="21"/>
+        </w:rPr>
+        <w:t xml:space="preserve"> 对该存储方案进行优化，要求如下：  </w:t>
+      </w:r>
+      <w:r>
+        <w:br/>
+      </w:r>
+      <w:r>
+        <w:rPr>
+          <w:rFonts w:ascii="宋体" w:hAnsi="宋体" w:cs="宋体" w:eastAsia="宋体"/>
+          <w:sz w:val="21"/>
+        </w:rPr>
+        <w:t xml:space="preserve">(1) 使用 </w:t>
+      </w:r>
+      <w:r>
+        <w:rPr>
+          <w:rFonts w:ascii="Consolas" w:hAnsi="Consolas" w:cs="Consolas" w:eastAsia="Consolas"/>
+          <w:sz w:val="21"/>
+        </w:rPr>
+        <w:t>HashMap&lt;String, Device&gt;</w:t>
+      </w:r>
+      <w:r>
+        <w:rPr>
+          <w:rFonts w:ascii="宋体" w:hAnsi="宋体" w:cs="宋体" w:eastAsia="宋体"/>
+          <w:sz w:val="21"/>
+        </w:rPr>
+        <w:t xml:space="preserve"> 保存设备信息，其中键为设备 </w:t>
+      </w:r>
+      <w:r>
+        <w:rPr>
+          <w:rFonts w:ascii="Consolas" w:hAnsi="Consolas" w:cs="Consolas" w:eastAsia="Consolas"/>
+          <w:sz w:val="21"/>
+        </w:rPr>
+        <w:t>id</w:t>
+      </w:r>
+      <w:r>
+        <w:rPr>
+          <w:rFonts w:ascii="宋体" w:hAnsi="宋体" w:cs="宋体" w:eastAsia="宋体"/>
+          <w:sz w:val="21"/>
+        </w:rPr>
+        <w:t xml:space="preserve">，值为对应的 </w:t>
+      </w:r>
+      <w:r>
+        <w:rPr>
+          <w:rFonts w:ascii="Consolas" w:hAnsi="Consolas" w:cs="Consolas" w:eastAsia="Consolas"/>
+          <w:sz w:val="21"/>
+        </w:rPr>
+        <w:t>Device</w:t>
+      </w:r>
+      <w:r>
+        <w:rPr>
+          <w:rFonts w:ascii="宋体" w:hAnsi="宋体" w:cs="宋体" w:eastAsia="宋体"/>
+          <w:sz w:val="21"/>
+        </w:rPr>
+        <w:t xml:space="preserve"> 对象。  </w:t>
+      </w:r>
+      <w:r>
+        <w:br/>
+      </w:r>
+      <w:r>
+        <w:rPr>
+          <w:rFonts w:ascii="宋体" w:hAnsi="宋体" w:cs="宋体" w:eastAsia="宋体"/>
+          <w:sz w:val="21"/>
+        </w:rPr>
+        <w:t>(2) 实现以下功能：</w:t>
+      </w:r>
+      <w:r>
+        <w:br/>
+      </w:r>
+      <w:r>
+        <w:rPr>
+          <w:rFonts w:ascii="宋体" w:hAnsi="宋体" w:cs="宋体" w:eastAsia="宋体"/>
+          <w:sz w:val="21"/>
+        </w:rPr>
+        <w:t xml:space="preserve">   - 添加设备信息</w:t>
+      </w:r>
+      <w:r>
+        <w:br/>
+      </w:r>
+      <w:r>
+        <w:rPr>
+          <w:rFonts w:ascii="宋体" w:hAnsi="宋体" w:cs="宋体" w:eastAsia="宋体"/>
+          <w:sz w:val="21"/>
+        </w:rPr>
+        <w:t xml:space="preserve">   - 根据 </w:t>
+      </w:r>
+      <w:r>
+        <w:rPr>
+          <w:rFonts w:ascii="Consolas" w:hAnsi="Consolas" w:cs="Consolas" w:eastAsia="Consolas"/>
+          <w:sz w:val="21"/>
+        </w:rPr>
+        <w:t>id</w:t>
+      </w:r>
+      <w:r>
+        <w:rPr>
+          <w:rFonts w:ascii="宋体" w:hAnsi="宋体" w:cs="宋体" w:eastAsia="宋体"/>
+          <w:sz w:val="21"/>
+        </w:rPr>
+        <w:t xml:space="preserve"> 查询设备信息</w:t>
+      </w:r>
+      <w:r>
+        <w:br/>
+      </w:r>
+      <w:r>
+        <w:rPr>
+          <w:rFonts w:ascii="宋体" w:hAnsi="宋体" w:cs="宋体" w:eastAsia="宋体"/>
+          <w:sz w:val="21"/>
+        </w:rPr>
+        <w:t xml:space="preserve">   - 根据 </w:t>
+      </w:r>
+      <w:r>
+        <w:rPr>
+          <w:rFonts w:ascii="Consolas" w:hAnsi="Consolas" w:cs="Consolas" w:eastAsia="Consolas"/>
+          <w:sz w:val="21"/>
+        </w:rPr>
+        <w:t>id</w:t>
+      </w:r>
+      <w:r>
+        <w:rPr>
+          <w:rFonts w:ascii="宋体" w:hAnsi="宋体" w:cs="宋体" w:eastAsia="宋体"/>
+          <w:sz w:val="21"/>
+        </w:rPr>
+        <w:t xml:space="preserve"> 删除设备信息  </w:t>
+      </w:r>
+      <w:r>
+        <w:br/>
+      </w:r>
+      <w:r>
+        <w:rPr>
+          <w:rFonts w:ascii="宋体" w:hAnsi="宋体" w:cs="宋体" w:eastAsia="宋体"/>
+          <w:sz w:val="21"/>
+        </w:rPr>
+        <w:t xml:space="preserve">(3) 编写 </w:t>
+      </w:r>
+      <w:r>
+        <w:rPr>
+          <w:rFonts w:ascii="Consolas" w:hAnsi="Consolas" w:cs="Consolas" w:eastAsia="Consolas"/>
+          <w:sz w:val="21"/>
+        </w:rPr>
+        <w:t>Main</w:t>
+      </w:r>
+      <w:r>
+        <w:rPr>
+          <w:rFonts w:ascii="宋体" w:hAnsi="宋体" w:cs="宋体" w:eastAsia="宋体"/>
+          <w:sz w:val="21"/>
+        </w:rPr>
+        <w:t xml:space="preserve"> 测试类，演示 </w:t>
+      </w:r>
+      <w:r>
+        <w:rPr>
+          <w:rFonts w:ascii="Consolas" w:hAnsi="Consolas" w:cs="Consolas" w:eastAsia="Consolas"/>
+          <w:sz w:val="21"/>
+        </w:rPr>
+        <w:t>HashMap</w:t>
+      </w:r>
+      <w:r>
+        <w:rPr>
+          <w:rFonts w:ascii="宋体" w:hAnsi="宋体" w:cs="宋体" w:eastAsia="宋体"/>
+          <w:sz w:val="21"/>
+        </w:rPr>
+        <w:t xml:space="preserve"> 的存储、查询和删除过程。</w:t>
+      </w:r>
+      <w:r>
+        <w:br/>
+      </w:r>
+      <w:r>
+        <w:rPr>
+          <w:b w:val="on"/>
+          <w:rFonts w:ascii="宋体" w:hAnsi="宋体" w:cs="宋体" w:eastAsia="宋体"/>
+          <w:sz w:val="21"/>
+        </w:rPr>
+        <w:t>测试数据示例：</w:t>
+      </w:r>
+      <w:r>
+        <w:br/>
+      </w:r>
+      <w:r>
+        <w:rPr>
+          <w:rFonts w:ascii="宋体" w:hAnsi="宋体" w:cs="宋体" w:eastAsia="宋体"/>
+          <w:sz w:val="21"/>
+        </w:rPr>
+        <w:t>- 添加设备：</w:t>
+      </w:r>
+      <w:r>
+        <w:br/>
+      </w:r>
+      <w:r>
+        <w:rPr>
+          <w:rFonts w:ascii="宋体" w:hAnsi="宋体" w:cs="宋体" w:eastAsia="宋体"/>
+          <w:sz w:val="21"/>
+        </w:rPr>
+        <w:t xml:space="preserve">  - </w:t>
+      </w:r>
+      <w:r>
+        <w:rPr>
+          <w:rFonts w:ascii="Consolas" w:hAnsi="Consolas" w:cs="Consolas" w:eastAsia="Consolas"/>
+          <w:sz w:val="21"/>
+        </w:rPr>
+        <w:t>101</w:t>
+      </w:r>
+      <w:r>
+        <w:rPr>
+          <w:rFonts w:ascii="宋体" w:hAnsi="宋体" w:cs="宋体" w:eastAsia="宋体"/>
+          <w:sz w:val="21"/>
+        </w:rPr>
+        <w:t>，</w:t>
+      </w:r>
+      <w:r>
+        <w:rPr>
+          <w:rFonts w:ascii="Consolas" w:hAnsi="Consolas" w:cs="Consolas" w:eastAsia="Consolas"/>
+          <w:sz w:val="21"/>
+        </w:rPr>
+        <w:t>智能灯</w:t>
+      </w:r>
+      <w:r>
+        <w:br/>
+      </w:r>
+      <w:r>
+        <w:rPr>
+          <w:rFonts w:ascii="宋体" w:hAnsi="宋体" w:cs="宋体" w:eastAsia="宋体"/>
+          <w:sz w:val="21"/>
+        </w:rPr>
+        <w:t xml:space="preserve">  - </w:t>
+      </w:r>
+      <w:r>
+        <w:rPr>
+          <w:rFonts w:ascii="Consolas" w:hAnsi="Consolas" w:cs="Consolas" w:eastAsia="Consolas"/>
+          <w:sz w:val="21"/>
+        </w:rPr>
+        <w:t>102</w:t>
+      </w:r>
+      <w:r>
+        <w:rPr>
+          <w:rFonts w:ascii="宋体" w:hAnsi="宋体" w:cs="宋体" w:eastAsia="宋体"/>
+          <w:sz w:val="21"/>
+        </w:rPr>
+        <w:t>，</w:t>
+      </w:r>
+      <w:r>
+        <w:rPr>
+          <w:rFonts w:ascii="Consolas" w:hAnsi="Consolas" w:cs="Consolas" w:eastAsia="Consolas"/>
+          <w:sz w:val="21"/>
+        </w:rPr>
+        <w:t>智能空调</w:t>
+      </w:r>
+      <w:r>
+        <w:br/>
+      </w:r>
+      <w:r>
+        <w:rPr>
+          <w:rFonts w:ascii="宋体" w:hAnsi="宋体" w:cs="宋体" w:eastAsia="宋体"/>
+          <w:sz w:val="21"/>
+        </w:rPr>
+        <w:t xml:space="preserve">  - </w:t>
+      </w:r>
+      <w:r>
+        <w:rPr>
+          <w:rFonts w:ascii="Consolas" w:hAnsi="Consolas" w:cs="Consolas" w:eastAsia="Consolas"/>
+          <w:sz w:val="21"/>
+        </w:rPr>
+        <w:t>103</w:t>
+      </w:r>
+      <w:r>
+        <w:rPr>
+          <w:rFonts w:ascii="宋体" w:hAnsi="宋体" w:cs="宋体" w:eastAsia="宋体"/>
+          <w:sz w:val="21"/>
+        </w:rPr>
+        <w:t>，</w:t>
+      </w:r>
+      <w:r>
+        <w:rPr>
+          <w:rFonts w:ascii="Consolas" w:hAnsi="Consolas" w:cs="Consolas" w:eastAsia="Consolas"/>
+          <w:sz w:val="21"/>
+        </w:rPr>
+        <w:t>智能门锁</w:t>
+      </w:r>
+      <w:r>
+        <w:br/>
+      </w:r>
+      <w:r>
+        <w:rPr>
+          <w:rFonts w:ascii="宋体" w:hAnsi="宋体" w:cs="宋体" w:eastAsia="宋体"/>
+          <w:sz w:val="21"/>
+        </w:rPr>
+        <w:t>- 查询设备：</w:t>
+      </w:r>
+      <w:r>
+        <w:rPr>
+          <w:rFonts w:ascii="Consolas" w:hAnsi="Consolas" w:cs="Consolas" w:eastAsia="Consolas"/>
+          <w:sz w:val="21"/>
+        </w:rPr>
+        <w:t>102</w:t>
+      </w:r>
+      <w:r>
+        <w:br/>
+      </w:r>
+      <w:r>
+        <w:rPr>
+          <w:rFonts w:ascii="宋体" w:hAnsi="宋体" w:cs="宋体" w:eastAsia="宋体"/>
+          <w:sz w:val="21"/>
+        </w:rPr>
+        <w:t>- 删除设备：</w:t>
+      </w:r>
+      <w:r>
+        <w:rPr>
+          <w:rFonts w:ascii="Consolas" w:hAnsi="Consolas" w:cs="Consolas" w:eastAsia="Consolas"/>
+          <w:sz w:val="21"/>
+        </w:rPr>
+        <w:t>102</w:t>
+      </w:r>
+      <w:r>
+        <w:br/>
+      </w:r>
+      <w:r>
+        <w:rPr>
+          <w:rFonts w:ascii="宋体" w:hAnsi="宋体" w:cs="宋体" w:eastAsia="宋体"/>
+          <w:sz w:val="21"/>
+        </w:rPr>
+        <w:t>- 删除后再次查询：</w:t>
+      </w:r>
+      <w:r>
+        <w:rPr>
+          <w:rFonts w:ascii="Consolas" w:hAnsi="Consolas" w:cs="Consolas" w:eastAsia="Consolas"/>
+          <w:sz w:val="21"/>
+        </w:rPr>
+        <w:t>102</w:t>
+      </w:r>
+      <w:r>
+        <w:br/>
+      </w:r>
+      <w:r>
+        <w:br/>
+      </w:r>
+      <w:r>
+        <w:rPr>
+          <w:b w:val="on"/>
+          <w:rFonts w:ascii="宋体" w:hAnsi="宋体" w:cs="宋体" w:eastAsia="宋体"/>
+          <w:sz w:val="21"/>
+        </w:rPr>
+        <w:t>预期输出示例：</w:t>
+      </w:r>
+    </w:p>
+    <w:p>
+      <w:pPr>
+        <w:shd w:val="clear" w:color="auto" w:fill="F4F4F4"/>
+        <w:spacing w:before="100" w:after="100"/>
+      </w:pPr>
+      <w:r>
+        <w:rPr>
+          <w:rFonts w:ascii="Consolas" w:hAnsi="Consolas" w:cs="Consolas" w:eastAsia="Consolas"/>
+          <w:sz w:val="20"/>
+        </w:rPr>
         <w:t>添加后设备数量：3</w:t>
       </w:r>
       <w:r>
@@ -2525,7 +2498,7 @@
           <w:rFonts w:ascii="Consolas" w:hAnsi="Consolas" w:cs="Consolas" w:eastAsia="Consolas"/>
           <w:sz w:val="20"/>
         </w:rPr>
-        <w:t>删除后再次查询 id=102：null</w:t>
+        <w:t>删除后再次查询 id=102：未找到</w:t>
       </w:r>
     </w:p>
     <w:p>
@@ -2535,31 +2508,6 @@
           <w:sz w:val="21"/>
         </w:rPr>
         <w:t>（请在已有工程 smarthome-hashmap-question 的基础上修改）</w:t>
-      </w:r>
-    </w:p>
-    <w:p>
-      <w:r>
-        <w:t/>
-      </w:r>
-    </w:p>
-    <w:p>
-      <w:r>
-        <w:t/>
-      </w:r>
-    </w:p>
-    <w:p>
-      <w:r>
-        <w:t/>
-      </w:r>
-    </w:p>
-    <w:p>
-      <w:r>
-        <w:t/>
-      </w:r>
-    </w:p>
-    <w:p>
-      <w:r>
-        <w:t/>
       </w:r>
     </w:p>
     <w:sectPr>

</xml_diff>